<commit_message>
Add online facilitator guide and print support
</commit_message>
<xml_diff>
--- a/Guida facilitatore - ItalBridge Transport.docx
+++ b/Guida facilitatore - ItalBridge Transport.docx
@@ -61,7 +61,7 @@
           </w:tcPr>
           <w:p>
             <w:r>
-              <w:t>benvenuto.html | settings.html | index.html | epilogo.html</w:t>
+              <w:t>index.html | settings.html | game.html | epilogo.html</w:t>
             </w:r>
           </w:p>
         </w:tc>
@@ -166,7 +166,7 @@
         <w:pStyle w:val="ListBullet"/>
       </w:pPr>
       <w:r>
-        <w:t>Aprire benvenuto.html sullo schermo condiviso.</w:t>
+        <w:t>Aprire index.html sullo schermo condiviso come pagina di benvenuto.</w:t>
       </w:r>
     </w:p>
     <w:p>
@@ -174,7 +174,7 @@
         <w:pStyle w:val="ListBullet"/>
       </w:pPr>
       <w:r>
-        <w:t>Tenere pronto index.html per avviare il game quando il gruppo è allineato.</w:t>
+        <w:t>Tenere pronto game.html per avviare il game quando il gruppo è allineato.</w:t>
       </w:r>
     </w:p>
     <w:p>
@@ -183,6 +183,54 @@
       </w:pPr>
       <w:r>
         <w:t>Verificare che demo finale e debrief finale si aprano correttamente.</w:t>
+      </w:r>
+    </w:p>
+    <w:p>
+      <w:pPr>
+        <w:pStyle w:val="Heading1"/>
+      </w:pPr>
+      <w:r>
+        <w:t>Checklist operativa del giorno del workshop</w:t>
+      </w:r>
+    </w:p>
+    <w:p>
+      <w:pPr>
+        <w:pStyle w:val="ListBullet"/>
+      </w:pPr>
+      <w:r>
+        <w:t>Aprire la pagina di benvenuto sullo schermo condiviso prima dell’ingresso dei partecipanti.</w:t>
+      </w:r>
+    </w:p>
+    <w:p>
+      <w:pPr>
+        <w:pStyle w:val="ListBullet"/>
+      </w:pPr>
+      <w:r>
+        <w:t>Impostare i mandati in settings.html sullo stesso browser che verrà usato per il game.</w:t>
+      </w:r>
+    </w:p>
+    <w:p>
+      <w:pPr>
+        <w:pStyle w:val="ListBullet"/>
+      </w:pPr>
+      <w:r>
+        <w:t>Tenere aperta la guida facilitatore per consultare scaletta e domande di debrief.</w:t>
+      </w:r>
+    </w:p>
+    <w:p>
+      <w:pPr>
+        <w:pStyle w:val="ListBullet"/>
+      </w:pPr>
+      <w:r>
+        <w:t>Avviare il game solo dopo aver verificato che i mandati risultino salvati.</w:t>
+      </w:r>
+    </w:p>
+    <w:p>
+      <w:pPr>
+        <w:pStyle w:val="ListBullet"/>
+      </w:pPr>
+      <w:r>
+        <w:t>Nel debrief finale, usare prima la lettura trasversale e solo dopo il confronto squadra per squadra.</w:t>
       </w:r>
     </w:p>
     <w:p>
@@ -267,7 +315,7 @@
           </w:tcPr>
           <w:p>
             <w:r>
-              <w:t>Mostrare benvenuto.html e spiegare scenario, logica dei 3 round e regola del debrief.</w:t>
+              <w:t>Mostrare index.html e spiegare scenario, logica dei 3 round e regola del debrief.</w:t>
             </w:r>
           </w:p>
         </w:tc>

</xml_diff>